<commit_message>
docs(nghien-cuu): 03 ghi 3 cau tra loi cua Truong phong SX (chat 24/10 09:30) vao md va phieu Word
Co-Authored-By: Claude Opus 5.5 <noreply@anthropic.com>
</commit_message>
<xml_diff>
--- a/doc/erp/nghien-cuu/03-mau-thuan-san-xuat-gui-phong-sx.docx
+++ b/doc/erp/nghien-cuu/03-mau-thuan-san-xuat-gui-phong-sx.docx
@@ -486,6 +486,31 @@
     </w:p>
     <w:p>
       <w:pPr>
+        <w:spacing w:before="0" w:after="40"/>
+        <w:ind w:left="340" w:hanging="227"/>
+      </w:pPr>
+      <w:r>
+        <w:rPr>
+          <w:rFonts w:ascii="Arial" w:hAnsi="Arial" w:eastAsia="Arial"/>
+          <w:b/>
+          <w:i w:val="0"/>
+          <w:color w:val="1F8A8A"/>
+          <w:sz w:val="20"/>
+        </w:rPr>
+        <w:t xml:space="preserve">•  </w:t>
+      </w:r>
+      <w:r>
+        <w:rPr>
+          <w:rFonts w:ascii="Arial" w:hAnsi="Arial" w:eastAsia="Arial"/>
+          <w:b w:val="0"/>
+          <w:i w:val="0"/>
+          <w:sz w:val="20"/>
+        </w:rPr>
+        <w:t>Các mục ghi Đã trả lời, chờ xác nhận văn bản đã in sẵn câu Trưởng phòng Sản xuất trả lời qua chat ngày 24/10/2026. Chỉ cần ký xác nhận hoặc sửa lại nếu chưa đúng.</w:t>
+      </w:r>
+    </w:p>
+    <w:p>
+      <w:pPr>
         <w:spacing w:before="160" w:after="80"/>
       </w:pPr>
       <w:r>
@@ -619,6 +644,30 @@
           <w:sz w:val="20"/>
         </w:rPr>
         <w:t>Chờ phân xử</w:t>
+      </w:r>
+    </w:p>
+    <w:p>
+      <w:pPr>
+        <w:spacing w:before="0" w:after="60"/>
+      </w:pPr>
+      <w:r>
+        <w:rPr>
+          <w:rFonts w:ascii="Arial" w:hAnsi="Arial" w:eastAsia="Arial"/>
+          <w:b/>
+          <w:i w:val="0"/>
+          <w:color w:val="E08A1E"/>
+          <w:sz w:val="20"/>
+        </w:rPr>
+        <w:t xml:space="preserve">Tình trạng trả lời: </w:t>
+      </w:r>
+      <w:r>
+        <w:rPr>
+          <w:rFonts w:ascii="Arial" w:hAnsi="Arial" w:eastAsia="Arial"/>
+          <w:b w:val="0"/>
+          <w:i w:val="0"/>
+          <w:sz w:val="20"/>
+        </w:rPr>
+        <w:t>Đã trả lời, chờ xác nhận văn bản</w:t>
       </w:r>
     </w:p>
     <w:tbl>
@@ -946,17 +995,31 @@
           </w:p>
           <w:p>
             <w:pPr>
-              <w:spacing w:before="200"/>
+              <w:spacing w:before="120"/>
             </w:pPr>
             <w:r>
               <w:rPr>
                 <w:rFonts w:ascii="Arial" w:hAnsi="Arial" w:eastAsia="Arial"/>
                 <w:b w:val="0"/>
                 <w:i w:val="0"/>
-                <w:color w:val="BFBFBF"/>
-                <w:sz w:val="16"/>
-              </w:rPr>
-              <w:t>.............................................................................................................................................................................................................</w:t>
+                <w:sz w:val="20"/>
+              </w:rPr>
+              <w:t>Người có thẩm quyền quyết định cuối cùng và cao nhất trong sản xuất là Trưởng phòng Sản xuất. Nhân sự hoặc phòng ban khác chỉ cung cấp thông tin để Trưởng phòng Sản xuất ra quyết định.</w:t>
+            </w:r>
+          </w:p>
+          <w:p>
+            <w:pPr>
+              <w:spacing w:before="60"/>
+            </w:pPr>
+            <w:r>
+              <w:rPr>
+                <w:rFonts w:ascii="Arial" w:hAnsi="Arial" w:eastAsia="Arial"/>
+                <w:b w:val="0"/>
+                <w:i/>
+                <w:color w:val="6B6B6B"/>
+                <w:sz w:val="18"/>
+              </w:rPr>
+              <w:t>Nguồn: Chị Ngân, Trưởng phòng SX, trả lời qua chat 24/10 09:30. Tình trạng: Đã trả lời, chờ xác nhận văn bản.</w:t>
             </w:r>
           </w:p>
           <w:p>
@@ -968,10 +1031,10 @@
                 <w:rFonts w:ascii="Arial" w:hAnsi="Arial" w:eastAsia="Arial"/>
                 <w:b w:val="0"/>
                 <w:i w:val="0"/>
-                <w:color w:val="BFBFBF"/>
-                <w:sz w:val="16"/>
-              </w:rPr>
-              <w:t>.............................................................................................................................................................................................................</w:t>
+                <w:color w:val="1A4D6B"/>
+                <w:sz w:val="18"/>
+              </w:rPr>
+              <w:t>Xác nhận: ....................................................................................................................................................................................</w:t>
             </w:r>
           </w:p>
           <w:p>
@@ -1044,7 +1107,7 @@
           <w:color w:val="6B6B6B"/>
           <w:sz w:val="17"/>
         </w:rPr>
-        <w:t>Nguồn A là giả thuyết MIC suy ra từ câu trả lời, chưa được người trả lời xác nhận (độ tin thấp). Nguồn B là as-is, độ tin cao. Theo nguồn A, thiếu VTBB thì lần lượt luân chuyển nội bộ, xin KD dời ngày, nhờ Thu mua mua thêm; không xong mới trình Trưởng phòng.</w:t>
+        <w:t>Đã có câu chốt từ Trưởng phòng Sản xuất. Câu này trái với ý kiến của Trưởng nhóm Quản lý dữ liệu và Chuyên viên Điều phối NL/BTP (Phòng Kinh doanh quyết), nên còn cần Phòng Kinh doanh hoặc Giám đốc xác nhận. Nguồn A là giả thuyết MIC suy ra từ câu trả lời, chưa được người trả lời xác nhận (độ tin thấp). Nguồn B là as-is, độ tin cao. Theo nguồn A, thiếu VTBB thì lần lượt luân chuyển nội bộ, xin KD dời ngày, nhờ Thu mua mua thêm; không xong mới trình Trưởng phòng.</w:t>
       </w:r>
     </w:p>
     <w:p>
@@ -1132,6 +1195,30 @@
           <w:sz w:val="20"/>
         </w:rPr>
         <w:t>Chờ phân xử</w:t>
+      </w:r>
+    </w:p>
+    <w:p>
+      <w:pPr>
+        <w:spacing w:before="0" w:after="60"/>
+      </w:pPr>
+      <w:r>
+        <w:rPr>
+          <w:rFonts w:ascii="Arial" w:hAnsi="Arial" w:eastAsia="Arial"/>
+          <w:b/>
+          <w:i w:val="0"/>
+          <w:color w:val="E08A1E"/>
+          <w:sz w:val="20"/>
+        </w:rPr>
+        <w:t xml:space="preserve">Tình trạng trả lời: </w:t>
+      </w:r>
+      <w:r>
+        <w:rPr>
+          <w:rFonts w:ascii="Arial" w:hAnsi="Arial" w:eastAsia="Arial"/>
+          <w:b w:val="0"/>
+          <w:i w:val="0"/>
+          <w:sz w:val="20"/>
+        </w:rPr>
+        <w:t>Đã trả lời, chờ xác nhận văn bản</w:t>
       </w:r>
     </w:p>
     <w:tbl>
@@ -1459,17 +1546,31 @@
           </w:p>
           <w:p>
             <w:pPr>
-              <w:spacing w:before="200"/>
+              <w:spacing w:before="120"/>
             </w:pPr>
             <w:r>
               <w:rPr>
                 <w:rFonts w:ascii="Arial" w:hAnsi="Arial" w:eastAsia="Arial"/>
                 <w:b w:val="0"/>
                 <w:i w:val="0"/>
-                <w:color w:val="BFBFBF"/>
-                <w:sz w:val="16"/>
-              </w:rPr>
-              <w:t>.............................................................................................................................................................................................................</w:t>
+                <w:sz w:val="20"/>
+              </w:rPr>
+              <w:t>Người có thẩm quyền quyết định cuối cùng và cao nhất trong sản xuất là Trưởng phòng Sản xuất. Nhân sự hoặc phòng ban khác chỉ cung cấp thông tin để Trưởng phòng Sản xuất ra quyết định.</w:t>
+            </w:r>
+          </w:p>
+          <w:p>
+            <w:pPr>
+              <w:spacing w:before="60"/>
+            </w:pPr>
+            <w:r>
+              <w:rPr>
+                <w:rFonts w:ascii="Arial" w:hAnsi="Arial" w:eastAsia="Arial"/>
+                <w:b w:val="0"/>
+                <w:i/>
+                <w:color w:val="6B6B6B"/>
+                <w:sz w:val="18"/>
+              </w:rPr>
+              <w:t>Nguồn: Chị Ngân, Trưởng phòng SX, trả lời qua chat 24/10 09:30. Tình trạng: Đã trả lời, chờ xác nhận văn bản.</w:t>
             </w:r>
           </w:p>
           <w:p>
@@ -1481,10 +1582,10 @@
                 <w:rFonts w:ascii="Arial" w:hAnsi="Arial" w:eastAsia="Arial"/>
                 <w:b w:val="0"/>
                 <w:i w:val="0"/>
-                <w:color w:val="BFBFBF"/>
-                <w:sz w:val="16"/>
-              </w:rPr>
-              <w:t>.............................................................................................................................................................................................................</w:t>
+                <w:color w:val="1A4D6B"/>
+                <w:sz w:val="18"/>
+              </w:rPr>
+              <w:t>Xác nhận: ....................................................................................................................................................................................</w:t>
             </w:r>
           </w:p>
           <w:p>
@@ -1557,7 +1658,7 @@
           <w:color w:val="6B6B6B"/>
           <w:sz w:val="17"/>
         </w:rPr>
-        <w:t>Cả hai là as-is. Trưởng phòng nói Trưởng phòng quyết cuối, kể cả duyệt trước bổ sung sau. Trưởng nhóm QLDL nói KD quyết.</w:t>
+        <w:t>Đã có câu chốt từ Trưởng phòng Sản xuất. Câu này trái với ý kiến của Trưởng nhóm Quản lý dữ liệu và Chuyên viên Điều phối NL/BTP (Phòng Kinh doanh quyết), nên còn cần Phòng Kinh doanh hoặc Giám đốc xác nhận. Cả hai là as-is. Trưởng phòng nói Trưởng phòng quyết cuối, kể cả duyệt trước bổ sung sau. Trưởng nhóm QLDL nói KD quyết.</w:t>
       </w:r>
     </w:p>
     <w:p>
@@ -1645,6 +1746,30 @@
           <w:sz w:val="20"/>
         </w:rPr>
         <w:t>Chờ phân xử</w:t>
+      </w:r>
+    </w:p>
+    <w:p>
+      <w:pPr>
+        <w:spacing w:before="0" w:after="60"/>
+      </w:pPr>
+      <w:r>
+        <w:rPr>
+          <w:rFonts w:ascii="Arial" w:hAnsi="Arial" w:eastAsia="Arial"/>
+          <w:b/>
+          <w:i w:val="0"/>
+          <w:color w:val="E08A1E"/>
+          <w:sz w:val="20"/>
+        </w:rPr>
+        <w:t xml:space="preserve">Tình trạng trả lời: </w:t>
+      </w:r>
+      <w:r>
+        <w:rPr>
+          <w:rFonts w:ascii="Arial" w:hAnsi="Arial" w:eastAsia="Arial"/>
+          <w:b w:val="0"/>
+          <w:i w:val="0"/>
+          <w:sz w:val="20"/>
+        </w:rPr>
+        <w:t>Đã trả lời, chờ xác nhận văn bản</w:t>
       </w:r>
     </w:p>
     <w:tbl>
@@ -1972,17 +2097,31 @@
           </w:p>
           <w:p>
             <w:pPr>
-              <w:spacing w:before="200"/>
+              <w:spacing w:before="120"/>
             </w:pPr>
             <w:r>
               <w:rPr>
                 <w:rFonts w:ascii="Arial" w:hAnsi="Arial" w:eastAsia="Arial"/>
                 <w:b w:val="0"/>
                 <w:i w:val="0"/>
-                <w:color w:val="BFBFBF"/>
-                <w:sz w:val="16"/>
-              </w:rPr>
-              <w:t>.............................................................................................................................................................................................................</w:t>
+                <w:sz w:val="20"/>
+              </w:rPr>
+              <w:t>Người có thẩm quyền quyết định cuối cùng và cao nhất trong sản xuất là Trưởng phòng Sản xuất. Nhân sự hoặc phòng ban khác chỉ cung cấp thông tin để Trưởng phòng Sản xuất ra quyết định.</w:t>
+            </w:r>
+          </w:p>
+          <w:p>
+            <w:pPr>
+              <w:spacing w:before="60"/>
+            </w:pPr>
+            <w:r>
+              <w:rPr>
+                <w:rFonts w:ascii="Arial" w:hAnsi="Arial" w:eastAsia="Arial"/>
+                <w:b w:val="0"/>
+                <w:i/>
+                <w:color w:val="6B6B6B"/>
+                <w:sz w:val="18"/>
+              </w:rPr>
+              <w:t>Nguồn: Chị Ngân, Trưởng phòng SX, trả lời qua chat 24/10 09:30. Tình trạng: Đã trả lời, chờ xác nhận văn bản.</w:t>
             </w:r>
           </w:p>
           <w:p>
@@ -1994,10 +2133,10 @@
                 <w:rFonts w:ascii="Arial" w:hAnsi="Arial" w:eastAsia="Arial"/>
                 <w:b w:val="0"/>
                 <w:i w:val="0"/>
-                <w:color w:val="BFBFBF"/>
-                <w:sz w:val="16"/>
-              </w:rPr>
-              <w:t>.............................................................................................................................................................................................................</w:t>
+                <w:color w:val="1A4D6B"/>
+                <w:sz w:val="18"/>
+              </w:rPr>
+              <w:t>Xác nhận: ....................................................................................................................................................................................</w:t>
             </w:r>
           </w:p>
           <w:p>
@@ -2070,7 +2209,7 @@
           <w:color w:val="6B6B6B"/>
           <w:sz w:val="17"/>
         </w:rPr>
-        <w:t>Cả hai là as-is, độ tin cao. Hai trưởng nhóm nói hai người quyết khác nhau. Theo danh sách vị trí trên MIC, Trưởng nhóm Điều phối đang do Trưởng phòng kiêm nhiệm.</w:t>
+        <w:t>Đã có câu chốt từ Trưởng phòng Sản xuất. Câu này trái với ý kiến của Trưởng nhóm Quản lý dữ liệu và Chuyên viên Điều phối NL/BTP (Phòng Kinh doanh quyết), nên còn cần Phòng Kinh doanh hoặc Giám đốc xác nhận. Cả hai là as-is, độ tin cao. Hai trưởng nhóm nói hai người quyết khác nhau. Theo danh sách vị trí trên MIC, Trưởng nhóm Điều phối đang do Trưởng phòng kiêm nhiệm.</w:t>
       </w:r>
     </w:p>
     <w:p>
@@ -2158,6 +2297,30 @@
           <w:sz w:val="20"/>
         </w:rPr>
         <w:t>Chờ phân xử</w:t>
+      </w:r>
+    </w:p>
+    <w:p>
+      <w:pPr>
+        <w:spacing w:before="0" w:after="60"/>
+      </w:pPr>
+      <w:r>
+        <w:rPr>
+          <w:rFonts w:ascii="Arial" w:hAnsi="Arial" w:eastAsia="Arial"/>
+          <w:b/>
+          <w:i w:val="0"/>
+          <w:color w:val="E08A1E"/>
+          <w:sz w:val="20"/>
+        </w:rPr>
+        <w:t xml:space="preserve">Tình trạng trả lời: </w:t>
+      </w:r>
+      <w:r>
+        <w:rPr>
+          <w:rFonts w:ascii="Arial" w:hAnsi="Arial" w:eastAsia="Arial"/>
+          <w:b w:val="0"/>
+          <w:i w:val="0"/>
+          <w:sz w:val="20"/>
+        </w:rPr>
+        <w:t>Đã trả lời, chờ xác nhận văn bản</w:t>
       </w:r>
     </w:p>
     <w:tbl>
@@ -2485,17 +2648,31 @@
           </w:p>
           <w:p>
             <w:pPr>
-              <w:spacing w:before="200"/>
+              <w:spacing w:before="120"/>
             </w:pPr>
             <w:r>
               <w:rPr>
                 <w:rFonts w:ascii="Arial" w:hAnsi="Arial" w:eastAsia="Arial"/>
                 <w:b w:val="0"/>
                 <w:i w:val="0"/>
-                <w:color w:val="BFBFBF"/>
-                <w:sz w:val="16"/>
-              </w:rPr>
-              <w:t>.............................................................................................................................................................................................................</w:t>
+                <w:sz w:val="20"/>
+              </w:rPr>
+              <w:t>Người có thẩm quyền quyết định cuối cùng và cao nhất trong sản xuất là Trưởng phòng Sản xuất. Nhân sự hoặc phòng ban khác chỉ cung cấp thông tin để Trưởng phòng Sản xuất ra quyết định.</w:t>
+            </w:r>
+          </w:p>
+          <w:p>
+            <w:pPr>
+              <w:spacing w:before="60"/>
+            </w:pPr>
+            <w:r>
+              <w:rPr>
+                <w:rFonts w:ascii="Arial" w:hAnsi="Arial" w:eastAsia="Arial"/>
+                <w:b w:val="0"/>
+                <w:i/>
+                <w:color w:val="6B6B6B"/>
+                <w:sz w:val="18"/>
+              </w:rPr>
+              <w:t>Nguồn: Chị Ngân, Trưởng phòng SX, trả lời qua chat 24/10 09:30. Tình trạng: Đã trả lời, chờ xác nhận văn bản.</w:t>
             </w:r>
           </w:p>
           <w:p>
@@ -2507,10 +2684,10 @@
                 <w:rFonts w:ascii="Arial" w:hAnsi="Arial" w:eastAsia="Arial"/>
                 <w:b w:val="0"/>
                 <w:i w:val="0"/>
-                <w:color w:val="BFBFBF"/>
-                <w:sz w:val="16"/>
-              </w:rPr>
-              <w:t>.............................................................................................................................................................................................................</w:t>
+                <w:color w:val="1A4D6B"/>
+                <w:sz w:val="18"/>
+              </w:rPr>
+              <w:t>Xác nhận: ....................................................................................................................................................................................</w:t>
             </w:r>
           </w:p>
           <w:p>
@@ -2583,7 +2760,7 @@
           <w:color w:val="6B6B6B"/>
           <w:sz w:val="17"/>
         </w:rPr>
-        <w:t>Chuyên viên VTBB nói Trưởng phòng hoặc KD, chưa phân định khi hai bên bất đồng.</w:t>
+        <w:t>Đã có câu chốt từ Trưởng phòng Sản xuất. Câu này trái với ý kiến của Trưởng nhóm Quản lý dữ liệu và Chuyên viên Điều phối NL/BTP (Phòng Kinh doanh quyết), nên còn cần Phòng Kinh doanh hoặc Giám đốc xác nhận. Chuyên viên VTBB nói Trưởng phòng hoặc KD, chưa phân định khi hai bên bất đồng.</w:t>
       </w:r>
     </w:p>
     <w:p>
@@ -2671,6 +2848,30 @@
           <w:sz w:val="20"/>
         </w:rPr>
         <w:t>Chờ phân xử</w:t>
+      </w:r>
+    </w:p>
+    <w:p>
+      <w:pPr>
+        <w:spacing w:before="0" w:after="60"/>
+      </w:pPr>
+      <w:r>
+        <w:rPr>
+          <w:rFonts w:ascii="Arial" w:hAnsi="Arial" w:eastAsia="Arial"/>
+          <w:b/>
+          <w:i w:val="0"/>
+          <w:color w:val="E08A1E"/>
+          <w:sz w:val="20"/>
+        </w:rPr>
+        <w:t xml:space="preserve">Tình trạng trả lời: </w:t>
+      </w:r>
+      <w:r>
+        <w:rPr>
+          <w:rFonts w:ascii="Arial" w:hAnsi="Arial" w:eastAsia="Arial"/>
+          <w:b w:val="0"/>
+          <w:i w:val="0"/>
+          <w:sz w:val="20"/>
+        </w:rPr>
+        <w:t>Đã trả lời, chờ xác nhận văn bản</w:t>
       </w:r>
     </w:p>
     <w:tbl>
@@ -2998,17 +3199,31 @@
           </w:p>
           <w:p>
             <w:pPr>
-              <w:spacing w:before="200"/>
+              <w:spacing w:before="120"/>
             </w:pPr>
             <w:r>
               <w:rPr>
                 <w:rFonts w:ascii="Arial" w:hAnsi="Arial" w:eastAsia="Arial"/>
                 <w:b w:val="0"/>
                 <w:i w:val="0"/>
-                <w:color w:val="BFBFBF"/>
-                <w:sz w:val="16"/>
-              </w:rPr>
-              <w:t>.............................................................................................................................................................................................................</w:t>
+                <w:sz w:val="20"/>
+              </w:rPr>
+              <w:t>Người có thẩm quyền quyết định cuối cùng và cao nhất trong sản xuất là Trưởng phòng Sản xuất. Nhân sự hoặc phòng ban khác chỉ cung cấp thông tin để Trưởng phòng Sản xuất ra quyết định.</w:t>
+            </w:r>
+          </w:p>
+          <w:p>
+            <w:pPr>
+              <w:spacing w:before="60"/>
+            </w:pPr>
+            <w:r>
+              <w:rPr>
+                <w:rFonts w:ascii="Arial" w:hAnsi="Arial" w:eastAsia="Arial"/>
+                <w:b w:val="0"/>
+                <w:i/>
+                <w:color w:val="6B6B6B"/>
+                <w:sz w:val="18"/>
+              </w:rPr>
+              <w:t>Nguồn: Chị Ngân, Trưởng phòng SX, trả lời qua chat 24/10 09:30. Tình trạng: Đã trả lời, chờ xác nhận văn bản.</w:t>
             </w:r>
           </w:p>
           <w:p>
@@ -3020,10 +3235,10 @@
                 <w:rFonts w:ascii="Arial" w:hAnsi="Arial" w:eastAsia="Arial"/>
                 <w:b w:val="0"/>
                 <w:i w:val="0"/>
-                <w:color w:val="BFBFBF"/>
-                <w:sz w:val="16"/>
-              </w:rPr>
-              <w:t>.............................................................................................................................................................................................................</w:t>
+                <w:color w:val="1A4D6B"/>
+                <w:sz w:val="18"/>
+              </w:rPr>
+              <w:t>Xác nhận: ....................................................................................................................................................................................</w:t>
             </w:r>
           </w:p>
           <w:p>
@@ -3096,7 +3311,7 @@
           <w:color w:val="6B6B6B"/>
           <w:sz w:val="17"/>
         </w:rPr>
-        <w:t>Chuyên viên NL/BTP nói KD quyết khi thiếu NL/BTP. Chuyên viên VTBB nói Trưởng phòng hoặc KD khi thiếu VTBB.</w:t>
+        <w:t>Đã có câu chốt từ Trưởng phòng Sản xuất. Câu này trái với ý kiến của Trưởng nhóm Quản lý dữ liệu và Chuyên viên Điều phối NL/BTP (Phòng Kinh doanh quyết), nên còn cần Phòng Kinh doanh hoặc Giám đốc xác nhận. Chuyên viên NL/BTP nói KD quyết khi thiếu NL/BTP. Chuyên viên VTBB nói Trưởng phòng hoặc KD khi thiếu VTBB.</w:t>
       </w:r>
     </w:p>
     <w:p>
@@ -3184,6 +3399,30 @@
           <w:sz w:val="20"/>
         </w:rPr>
         <w:t>Chờ phân xử</w:t>
+      </w:r>
+    </w:p>
+    <w:p>
+      <w:pPr>
+        <w:spacing w:before="0" w:after="60"/>
+      </w:pPr>
+      <w:r>
+        <w:rPr>
+          <w:rFonts w:ascii="Arial" w:hAnsi="Arial" w:eastAsia="Arial"/>
+          <w:b/>
+          <w:i w:val="0"/>
+          <w:color w:val="E08A1E"/>
+          <w:sz w:val="20"/>
+        </w:rPr>
+        <w:t xml:space="preserve">Tình trạng trả lời: </w:t>
+      </w:r>
+      <w:r>
+        <w:rPr>
+          <w:rFonts w:ascii="Arial" w:hAnsi="Arial" w:eastAsia="Arial"/>
+          <w:b w:val="0"/>
+          <w:i w:val="0"/>
+          <w:sz w:val="20"/>
+        </w:rPr>
+        <w:t>Đã trả lời, chờ xác nhận văn bản</w:t>
       </w:r>
     </w:p>
     <w:tbl>
@@ -3511,17 +3750,31 @@
           </w:p>
           <w:p>
             <w:pPr>
-              <w:spacing w:before="200"/>
+              <w:spacing w:before="120"/>
             </w:pPr>
             <w:r>
               <w:rPr>
                 <w:rFonts w:ascii="Arial" w:hAnsi="Arial" w:eastAsia="Arial"/>
                 <w:b w:val="0"/>
                 <w:i w:val="0"/>
-                <w:color w:val="BFBFBF"/>
-                <w:sz w:val="16"/>
-              </w:rPr>
-              <w:t>.............................................................................................................................................................................................................</w:t>
+                <w:sz w:val="20"/>
+              </w:rPr>
+              <w:t>Người có thẩm quyền quyết định cuối cùng và cao nhất trong sản xuất là Trưởng phòng Sản xuất. Nhân sự hoặc phòng ban khác chỉ cung cấp thông tin để Trưởng phòng Sản xuất ra quyết định.</w:t>
+            </w:r>
+          </w:p>
+          <w:p>
+            <w:pPr>
+              <w:spacing w:before="60"/>
+            </w:pPr>
+            <w:r>
+              <w:rPr>
+                <w:rFonts w:ascii="Arial" w:hAnsi="Arial" w:eastAsia="Arial"/>
+                <w:b w:val="0"/>
+                <w:i/>
+                <w:color w:val="6B6B6B"/>
+                <w:sz w:val="18"/>
+              </w:rPr>
+              <w:t>Nguồn: Chị Ngân, Trưởng phòng SX, trả lời qua chat 24/10 09:30. Tình trạng: Đã trả lời, chờ xác nhận văn bản.</w:t>
             </w:r>
           </w:p>
           <w:p>
@@ -3533,10 +3786,10 @@
                 <w:rFonts w:ascii="Arial" w:hAnsi="Arial" w:eastAsia="Arial"/>
                 <w:b w:val="0"/>
                 <w:i w:val="0"/>
-                <w:color w:val="BFBFBF"/>
-                <w:sz w:val="16"/>
-              </w:rPr>
-              <w:t>.............................................................................................................................................................................................................</w:t>
+                <w:color w:val="1A4D6B"/>
+                <w:sz w:val="18"/>
+              </w:rPr>
+              <w:t>Xác nhận: ....................................................................................................................................................................................</w:t>
             </w:r>
           </w:p>
           <w:p>
@@ -3609,7 +3862,7 @@
           <w:color w:val="6B6B6B"/>
           <w:sz w:val="17"/>
         </w:rPr>
-        <w:t>Trưởng phòng nói mình quyết. Trưởng nhóm QLDL (vòng 3) nói báo cả KD và Quản lý cùng xem xét.</w:t>
+        <w:t>Đã có câu chốt từ Trưởng phòng Sản xuất. Câu này trái với ý kiến của Trưởng nhóm Quản lý dữ liệu và Chuyên viên Điều phối NL/BTP (Phòng Kinh doanh quyết), nên còn cần Phòng Kinh doanh hoặc Giám đốc xác nhận. Trưởng phòng nói mình quyết. Trưởng nhóm QLDL (vòng 3) nói báo cả KD và Quản lý cùng xem xét.</w:t>
       </w:r>
     </w:p>
     <w:p>
@@ -3697,6 +3950,30 @@
           <w:sz w:val="20"/>
         </w:rPr>
         <w:t>Chờ phân xử</w:t>
+      </w:r>
+    </w:p>
+    <w:p>
+      <w:pPr>
+        <w:spacing w:before="0" w:after="60"/>
+      </w:pPr>
+      <w:r>
+        <w:rPr>
+          <w:rFonts w:ascii="Arial" w:hAnsi="Arial" w:eastAsia="Arial"/>
+          <w:b/>
+          <w:i w:val="0"/>
+          <w:color w:val="E08A1E"/>
+          <w:sz w:val="20"/>
+        </w:rPr>
+        <w:t xml:space="preserve">Tình trạng trả lời: </w:t>
+      </w:r>
+      <w:r>
+        <w:rPr>
+          <w:rFonts w:ascii="Arial" w:hAnsi="Arial" w:eastAsia="Arial"/>
+          <w:b w:val="0"/>
+          <w:i w:val="0"/>
+          <w:sz w:val="20"/>
+        </w:rPr>
+        <w:t>Đã trả lời, chờ xác nhận văn bản</w:t>
       </w:r>
     </w:p>
     <w:tbl>
@@ -4024,17 +4301,31 @@
           </w:p>
           <w:p>
             <w:pPr>
-              <w:spacing w:before="200"/>
+              <w:spacing w:before="120"/>
             </w:pPr>
             <w:r>
               <w:rPr>
                 <w:rFonts w:ascii="Arial" w:hAnsi="Arial" w:eastAsia="Arial"/>
                 <w:b w:val="0"/>
                 <w:i w:val="0"/>
-                <w:color w:val="BFBFBF"/>
-                <w:sz w:val="16"/>
-              </w:rPr>
-              <w:t>.............................................................................................................................................................................................................</w:t>
+                <w:sz w:val="20"/>
+              </w:rPr>
+              <w:t>Người có thẩm quyền quyết định cuối cùng và cao nhất trong sản xuất là Trưởng phòng Sản xuất. Nhân sự hoặc phòng ban khác chỉ cung cấp thông tin để Trưởng phòng Sản xuất ra quyết định.</w:t>
+            </w:r>
+          </w:p>
+          <w:p>
+            <w:pPr>
+              <w:spacing w:before="60"/>
+            </w:pPr>
+            <w:r>
+              <w:rPr>
+                <w:rFonts w:ascii="Arial" w:hAnsi="Arial" w:eastAsia="Arial"/>
+                <w:b w:val="0"/>
+                <w:i/>
+                <w:color w:val="6B6B6B"/>
+                <w:sz w:val="18"/>
+              </w:rPr>
+              <w:t>Nguồn: Chị Ngân, Trưởng phòng SX, trả lời qua chat 24/10 09:30. Tình trạng: Đã trả lời, chờ xác nhận văn bản.</w:t>
             </w:r>
           </w:p>
           <w:p>
@@ -4046,10 +4337,10 @@
                 <w:rFonts w:ascii="Arial" w:hAnsi="Arial" w:eastAsia="Arial"/>
                 <w:b w:val="0"/>
                 <w:i w:val="0"/>
-                <w:color w:val="BFBFBF"/>
-                <w:sz w:val="16"/>
-              </w:rPr>
-              <w:t>.............................................................................................................................................................................................................</w:t>
+                <w:color w:val="1A4D6B"/>
+                <w:sz w:val="18"/>
+              </w:rPr>
+              <w:t>Xác nhận: ....................................................................................................................................................................................</w:t>
             </w:r>
           </w:p>
           <w:p>
@@ -4122,7 +4413,7 @@
           <w:color w:val="6B6B6B"/>
           <w:sz w:val="17"/>
         </w:rPr>
-        <w:t>KD quyết, so với KD và Quản lý cùng quyết.</w:t>
+        <w:t>Đã có câu chốt từ Trưởng phòng Sản xuất. Câu này trái với ý kiến của Trưởng nhóm Quản lý dữ liệu và Chuyên viên Điều phối NL/BTP (Phòng Kinh doanh quyết), nên còn cần Phòng Kinh doanh hoặc Giám đốc xác nhận. KD quyết, so với KD và Quản lý cùng quyết.</w:t>
       </w:r>
     </w:p>
     <w:p>
@@ -4725,6 +5016,30 @@
         <w:t>Chờ phân xử</w:t>
       </w:r>
     </w:p>
+    <w:p>
+      <w:pPr>
+        <w:spacing w:before="0" w:after="60"/>
+      </w:pPr>
+      <w:r>
+        <w:rPr>
+          <w:rFonts w:ascii="Arial" w:hAnsi="Arial" w:eastAsia="Arial"/>
+          <w:b/>
+          <w:i w:val="0"/>
+          <w:color w:val="E08A1E"/>
+          <w:sz w:val="20"/>
+        </w:rPr>
+        <w:t xml:space="preserve">Tình trạng trả lời: </w:t>
+      </w:r>
+      <w:r>
+        <w:rPr>
+          <w:rFonts w:ascii="Arial" w:hAnsi="Arial" w:eastAsia="Arial"/>
+          <w:b w:val="0"/>
+          <w:i w:val="0"/>
+          <w:sz w:val="20"/>
+        </w:rPr>
+        <w:t>Đã trả lời, chờ xác nhận văn bản</w:t>
+      </w:r>
+    </w:p>
     <w:tbl>
       <w:tblPr>
         <w:tblW w:type="dxa" w:w="9639"/>
@@ -5050,17 +5365,31 @@
           </w:p>
           <w:p>
             <w:pPr>
-              <w:spacing w:before="200"/>
+              <w:spacing w:before="120"/>
             </w:pPr>
             <w:r>
               <w:rPr>
                 <w:rFonts w:ascii="Arial" w:hAnsi="Arial" w:eastAsia="Arial"/>
                 <w:b w:val="0"/>
                 <w:i w:val="0"/>
-                <w:color w:val="BFBFBF"/>
-                <w:sz w:val="16"/>
-              </w:rPr>
-              <w:t>.............................................................................................................................................................................................................</w:t>
+                <w:sz w:val="20"/>
+              </w:rPr>
+              <w:t>Người có thẩm quyền quyết định cuối cùng và cao nhất trong sản xuất là Trưởng phòng Sản xuất. Nhân sự hoặc phòng ban khác chỉ cung cấp thông tin để Trưởng phòng Sản xuất ra quyết định.</w:t>
+            </w:r>
+          </w:p>
+          <w:p>
+            <w:pPr>
+              <w:spacing w:before="60"/>
+            </w:pPr>
+            <w:r>
+              <w:rPr>
+                <w:rFonts w:ascii="Arial" w:hAnsi="Arial" w:eastAsia="Arial"/>
+                <w:b w:val="0"/>
+                <w:i/>
+                <w:color w:val="6B6B6B"/>
+                <w:sz w:val="18"/>
+              </w:rPr>
+              <w:t>Nguồn: Chị Ngân, Trưởng phòng SX, trả lời qua chat 24/10 09:30. Tình trạng: Đã trả lời, chờ xác nhận văn bản.</w:t>
             </w:r>
           </w:p>
           <w:p>
@@ -5072,10 +5401,10 @@
                 <w:rFonts w:ascii="Arial" w:hAnsi="Arial" w:eastAsia="Arial"/>
                 <w:b w:val="0"/>
                 <w:i w:val="0"/>
-                <w:color w:val="BFBFBF"/>
-                <w:sz w:val="16"/>
-              </w:rPr>
-              <w:t>.............................................................................................................................................................................................................</w:t>
+                <w:color w:val="1A4D6B"/>
+                <w:sz w:val="18"/>
+              </w:rPr>
+              <w:t>Xác nhận: ....................................................................................................................................................................................</w:t>
             </w:r>
           </w:p>
           <w:p>
@@ -5148,7 +5477,7 @@
           <w:color w:val="6B6B6B"/>
           <w:sz w:val="17"/>
         </w:rPr>
-        <w:t>KD quyết khi thiếu NL/BTP, so với Quản lý sản xuất quyết khi hồ sơ pháp lý chưa đạt. Hai câu có thể nói về hai loại vướng mắc khác nhau.</w:t>
+        <w:t>Đã có câu chốt từ Trưởng phòng Sản xuất. Câu này trái với ý kiến của Trưởng nhóm Quản lý dữ liệu và Chuyên viên Điều phối NL/BTP (Phòng Kinh doanh quyết), nên còn cần Phòng Kinh doanh hoặc Giám đốc xác nhận. KD quyết khi thiếu NL/BTP, so với Quản lý sản xuất quyết khi hồ sơ pháp lý chưa đạt. Hai câu có thể nói về hai loại vướng mắc khác nhau.</w:t>
       </w:r>
     </w:p>
     <w:p>
@@ -5236,6 +5565,30 @@
           <w:sz w:val="20"/>
         </w:rPr>
         <w:t>Chờ phân xử</w:t>
+      </w:r>
+    </w:p>
+    <w:p>
+      <w:pPr>
+        <w:spacing w:before="0" w:after="60"/>
+      </w:pPr>
+      <w:r>
+        <w:rPr>
+          <w:rFonts w:ascii="Arial" w:hAnsi="Arial" w:eastAsia="Arial"/>
+          <w:b/>
+          <w:i w:val="0"/>
+          <w:color w:val="E08A1E"/>
+          <w:sz w:val="20"/>
+        </w:rPr>
+        <w:t xml:space="preserve">Tình trạng trả lời: </w:t>
+      </w:r>
+      <w:r>
+        <w:rPr>
+          <w:rFonts w:ascii="Arial" w:hAnsi="Arial" w:eastAsia="Arial"/>
+          <w:b w:val="0"/>
+          <w:i w:val="0"/>
+          <w:sz w:val="20"/>
+        </w:rPr>
+        <w:t>Đã trả lời, chờ xác nhận văn bản</w:t>
       </w:r>
     </w:p>
     <w:tbl>
@@ -5563,17 +5916,31 @@
           </w:p>
           <w:p>
             <w:pPr>
-              <w:spacing w:before="200"/>
+              <w:spacing w:before="120"/>
             </w:pPr>
             <w:r>
               <w:rPr>
                 <w:rFonts w:ascii="Arial" w:hAnsi="Arial" w:eastAsia="Arial"/>
                 <w:b w:val="0"/>
                 <w:i w:val="0"/>
-                <w:color w:val="BFBFBF"/>
-                <w:sz w:val="16"/>
-              </w:rPr>
-              <w:t>.............................................................................................................................................................................................................</w:t>
+                <w:sz w:val="20"/>
+              </w:rPr>
+              <w:t>Người có thẩm quyền quyết định cuối cùng và cao nhất trong sản xuất là Trưởng phòng Sản xuất. Nhân sự hoặc phòng ban khác chỉ cung cấp thông tin để Trưởng phòng Sản xuất ra quyết định.</w:t>
+            </w:r>
+          </w:p>
+          <w:p>
+            <w:pPr>
+              <w:spacing w:before="60"/>
+            </w:pPr>
+            <w:r>
+              <w:rPr>
+                <w:rFonts w:ascii="Arial" w:hAnsi="Arial" w:eastAsia="Arial"/>
+                <w:b w:val="0"/>
+                <w:i/>
+                <w:color w:val="6B6B6B"/>
+                <w:sz w:val="18"/>
+              </w:rPr>
+              <w:t>Nguồn: Chị Ngân, Trưởng phòng SX, trả lời qua chat 24/10 09:30. Tình trạng: Đã trả lời, chờ xác nhận văn bản.</w:t>
             </w:r>
           </w:p>
           <w:p>
@@ -5585,10 +5952,10 @@
                 <w:rFonts w:ascii="Arial" w:hAnsi="Arial" w:eastAsia="Arial"/>
                 <w:b w:val="0"/>
                 <w:i w:val="0"/>
-                <w:color w:val="BFBFBF"/>
-                <w:sz w:val="16"/>
-              </w:rPr>
-              <w:t>.............................................................................................................................................................................................................</w:t>
+                <w:color w:val="1A4D6B"/>
+                <w:sz w:val="18"/>
+              </w:rPr>
+              <w:t>Xác nhận: ....................................................................................................................................................................................</w:t>
             </w:r>
           </w:p>
           <w:p>
@@ -5661,7 +6028,7 @@
           <w:color w:val="6B6B6B"/>
           <w:sz w:val="17"/>
         </w:rPr>
-        <w:t>KD quyết, so với Trưởng phòng quyết.</w:t>
+        <w:t>Đã có câu chốt từ Trưởng phòng Sản xuất. Câu này trái với ý kiến của Trưởng nhóm Quản lý dữ liệu và Chuyên viên Điều phối NL/BTP (Phòng Kinh doanh quyết), nên còn cần Phòng Kinh doanh hoặc Giám đốc xác nhận. KD quyết, so với Trưởng phòng quyết.</w:t>
       </w:r>
     </w:p>
     <w:p>
@@ -5749,6 +6116,30 @@
           <w:sz w:val="20"/>
         </w:rPr>
         <w:t>Chờ phân xử</w:t>
+      </w:r>
+    </w:p>
+    <w:p>
+      <w:pPr>
+        <w:spacing w:before="0" w:after="60"/>
+      </w:pPr>
+      <w:r>
+        <w:rPr>
+          <w:rFonts w:ascii="Arial" w:hAnsi="Arial" w:eastAsia="Arial"/>
+          <w:b/>
+          <w:i w:val="0"/>
+          <w:color w:val="E08A1E"/>
+          <w:sz w:val="20"/>
+        </w:rPr>
+        <w:t xml:space="preserve">Tình trạng trả lời: </w:t>
+      </w:r>
+      <w:r>
+        <w:rPr>
+          <w:rFonts w:ascii="Arial" w:hAnsi="Arial" w:eastAsia="Arial"/>
+          <w:b w:val="0"/>
+          <w:i w:val="0"/>
+          <w:sz w:val="20"/>
+        </w:rPr>
+        <w:t>Đã trả lời, chờ xác nhận văn bản</w:t>
       </w:r>
     </w:p>
     <w:tbl>
@@ -6076,17 +6467,31 @@
           </w:p>
           <w:p>
             <w:pPr>
-              <w:spacing w:before="200"/>
+              <w:spacing w:before="120"/>
             </w:pPr>
             <w:r>
               <w:rPr>
                 <w:rFonts w:ascii="Arial" w:hAnsi="Arial" w:eastAsia="Arial"/>
                 <w:b w:val="0"/>
                 <w:i w:val="0"/>
-                <w:color w:val="BFBFBF"/>
-                <w:sz w:val="16"/>
-              </w:rPr>
-              <w:t>.............................................................................................................................................................................................................</w:t>
+                <w:sz w:val="20"/>
+              </w:rPr>
+              <w:t>Người có thẩm quyền quyết định cuối cùng và cao nhất trong sản xuất là Trưởng phòng Sản xuất. Nhân sự hoặc phòng ban khác chỉ cung cấp thông tin để Trưởng phòng Sản xuất ra quyết định.</w:t>
+            </w:r>
+          </w:p>
+          <w:p>
+            <w:pPr>
+              <w:spacing w:before="60"/>
+            </w:pPr>
+            <w:r>
+              <w:rPr>
+                <w:rFonts w:ascii="Arial" w:hAnsi="Arial" w:eastAsia="Arial"/>
+                <w:b w:val="0"/>
+                <w:i/>
+                <w:color w:val="6B6B6B"/>
+                <w:sz w:val="18"/>
+              </w:rPr>
+              <w:t>Nguồn: Chị Ngân, Trưởng phòng SX, trả lời qua chat 24/10 09:30. Tình trạng: Đã trả lời, chờ xác nhận văn bản.</w:t>
             </w:r>
           </w:p>
           <w:p>
@@ -6098,10 +6503,10 @@
                 <w:rFonts w:ascii="Arial" w:hAnsi="Arial" w:eastAsia="Arial"/>
                 <w:b w:val="0"/>
                 <w:i w:val="0"/>
-                <w:color w:val="BFBFBF"/>
-                <w:sz w:val="16"/>
-              </w:rPr>
-              <w:t>.............................................................................................................................................................................................................</w:t>
+                <w:color w:val="1A4D6B"/>
+                <w:sz w:val="18"/>
+              </w:rPr>
+              <w:t>Xác nhận: ....................................................................................................................................................................................</w:t>
             </w:r>
           </w:p>
           <w:p>
@@ -6174,7 +6579,7 @@
           <w:color w:val="6B6B6B"/>
           <w:sz w:val="17"/>
         </w:rPr>
-        <w:t>KD quyết, so với Quản lý sản xuất quyết (Trưởng nhóm Điều phối chỉ báo lại tiến độ cho KD).</w:t>
+        <w:t>Đã có câu chốt từ Trưởng phòng Sản xuất. Câu này trái với ý kiến của Trưởng nhóm Quản lý dữ liệu và Chuyên viên Điều phối NL/BTP (Phòng Kinh doanh quyết), nên còn cần Phòng Kinh doanh hoặc Giám đốc xác nhận. KD quyết, so với Quản lý sản xuất quyết (Trưởng nhóm Điều phối chỉ báo lại tiến độ cho KD).</w:t>
       </w:r>
     </w:p>
     <w:p>
@@ -6262,6 +6667,30 @@
           <w:sz w:val="20"/>
         </w:rPr>
         <w:t>Chờ phân xử</w:t>
+      </w:r>
+    </w:p>
+    <w:p>
+      <w:pPr>
+        <w:spacing w:before="0" w:after="60"/>
+      </w:pPr>
+      <w:r>
+        <w:rPr>
+          <w:rFonts w:ascii="Arial" w:hAnsi="Arial" w:eastAsia="Arial"/>
+          <w:b/>
+          <w:i w:val="0"/>
+          <w:color w:val="E08A1E"/>
+          <w:sz w:val="20"/>
+        </w:rPr>
+        <w:t xml:space="preserve">Tình trạng trả lời: </w:t>
+      </w:r>
+      <w:r>
+        <w:rPr>
+          <w:rFonts w:ascii="Arial" w:hAnsi="Arial" w:eastAsia="Arial"/>
+          <w:b w:val="0"/>
+          <w:i w:val="0"/>
+          <w:sz w:val="20"/>
+        </w:rPr>
+        <w:t>Đã trả lời, chờ xác nhận văn bản</w:t>
       </w:r>
     </w:p>
     <w:tbl>
@@ -6589,17 +7018,31 @@
           </w:p>
           <w:p>
             <w:pPr>
-              <w:spacing w:before="200"/>
+              <w:spacing w:before="120"/>
             </w:pPr>
             <w:r>
               <w:rPr>
                 <w:rFonts w:ascii="Arial" w:hAnsi="Arial" w:eastAsia="Arial"/>
                 <w:b w:val="0"/>
                 <w:i w:val="0"/>
-                <w:color w:val="BFBFBF"/>
-                <w:sz w:val="16"/>
-              </w:rPr>
-              <w:t>.............................................................................................................................................................................................................</w:t>
+                <w:sz w:val="20"/>
+              </w:rPr>
+              <w:t>Chưa có ngân sách, chỉ có chi phí thực chi, chưa có giới hạn ngân sách. Giám đốc không phê duyệt chi phí, chỉ tới cấp Trưởng phòng.</w:t>
+            </w:r>
+          </w:p>
+          <w:p>
+            <w:pPr>
+              <w:spacing w:before="60"/>
+            </w:pPr>
+            <w:r>
+              <w:rPr>
+                <w:rFonts w:ascii="Arial" w:hAnsi="Arial" w:eastAsia="Arial"/>
+                <w:b w:val="0"/>
+                <w:i/>
+                <w:color w:val="6B6B6B"/>
+                <w:sz w:val="18"/>
+              </w:rPr>
+              <w:t>Nguồn: Chị Ngân, Trưởng phòng SX, trả lời qua chat 24/10 09:30. Tình trạng: Đã trả lời, chờ xác nhận văn bản.</w:t>
             </w:r>
           </w:p>
           <w:p>
@@ -6611,10 +7054,10 @@
                 <w:rFonts w:ascii="Arial" w:hAnsi="Arial" w:eastAsia="Arial"/>
                 <w:b w:val="0"/>
                 <w:i w:val="0"/>
-                <w:color w:val="BFBFBF"/>
-                <w:sz w:val="16"/>
-              </w:rPr>
-              <w:t>.............................................................................................................................................................................................................</w:t>
+                <w:color w:val="1A4D6B"/>
+                <w:sz w:val="18"/>
+              </w:rPr>
+              <w:t>Xác nhận: ....................................................................................................................................................................................</w:t>
             </w:r>
           </w:p>
           <w:p>
@@ -6687,7 +7130,7 @@
           <w:color w:val="6B6B6B"/>
           <w:sz w:val="17"/>
         </w:rPr>
-        <w:t>Trưởng phòng nói không có ngân sách dự toán nên không duyệt chi phí phát sinh. Giám đốc nói chi phí ngoài ngân sách phải trình Giám đốc phụ trách công ty tương ứng. Có thể hai câu nói về hai việc: không có ngân sách theo đơn hàng, nhưng chi phí phát sinh vẫn phải xin duyệt. Xem thêm L02.</w:t>
+        <w:t>Câu trả lời này khác câu Giám đốc trả lời ở vòng 1 (chi phí ngoài ngân sách phải trình Giám đốc phụ trách) và khác hạn mức 3 triệu, 5 triệu trong tệp quy trình thanh toán, nên còn cần Giám đốc xác nhận. Trưởng phòng nói không có ngân sách dự toán nên không duyệt chi phí phát sinh. Giám đốc nói chi phí ngoài ngân sách phải trình Giám đốc phụ trách công ty tương ứng. Có thể hai câu nói về hai việc: không có ngân sách theo đơn hàng, nhưng chi phí phát sinh vẫn phải xin duyệt. Xem thêm L02.</w:t>
       </w:r>
     </w:p>
     <w:p>
@@ -6775,6 +7218,30 @@
           <w:sz w:val="20"/>
         </w:rPr>
         <w:t>Đã hỏi lại hai bên</w:t>
+      </w:r>
+    </w:p>
+    <w:p>
+      <w:pPr>
+        <w:spacing w:before="0" w:after="60"/>
+      </w:pPr>
+      <w:r>
+        <w:rPr>
+          <w:rFonts w:ascii="Arial" w:hAnsi="Arial" w:eastAsia="Arial"/>
+          <w:b/>
+          <w:i w:val="0"/>
+          <w:color w:val="E08A1E"/>
+          <w:sz w:val="20"/>
+        </w:rPr>
+        <w:t xml:space="preserve">Tình trạng trả lời: </w:t>
+      </w:r>
+      <w:r>
+        <w:rPr>
+          <w:rFonts w:ascii="Arial" w:hAnsi="Arial" w:eastAsia="Arial"/>
+          <w:b w:val="0"/>
+          <w:i w:val="0"/>
+          <w:sz w:val="20"/>
+        </w:rPr>
+        <w:t>Đã trả lời, chờ xác nhận văn bản</w:t>
       </w:r>
     </w:p>
     <w:tbl>
@@ -7087,17 +7554,31 @@
           </w:p>
           <w:p>
             <w:pPr>
-              <w:spacing w:before="200"/>
+              <w:spacing w:before="120"/>
             </w:pPr>
             <w:r>
               <w:rPr>
                 <w:rFonts w:ascii="Arial" w:hAnsi="Arial" w:eastAsia="Arial"/>
                 <w:b w:val="0"/>
                 <w:i w:val="0"/>
-                <w:color w:val="BFBFBF"/>
-                <w:sz w:val="16"/>
-              </w:rPr>
-              <w:t>.............................................................................................................................................................................................................</w:t>
+                <w:sz w:val="20"/>
+              </w:rPr>
+              <w:t>Duyệt hợp đồng và duyệt chi phí là hai nội dung khác nhau. Duyệt hợp đồng theo quy trình. Duyệt chi phí theo câu trả lời về chi phí: Chưa có ngân sách, chỉ có chi phí thực chi, chưa có giới hạn ngân sách. Giám đốc không phê duyệt chi phí, chỉ tới cấp Trưởng phòng.</w:t>
+            </w:r>
+          </w:p>
+          <w:p>
+            <w:pPr>
+              <w:spacing w:before="60"/>
+            </w:pPr>
+            <w:r>
+              <w:rPr>
+                <w:rFonts w:ascii="Arial" w:hAnsi="Arial" w:eastAsia="Arial"/>
+                <w:b w:val="0"/>
+                <w:i/>
+                <w:color w:val="6B6B6B"/>
+                <w:sz w:val="18"/>
+              </w:rPr>
+              <w:t>Nguồn: Chị Ngân, Trưởng phòng SX, trả lời qua chat 24/10 09:30. Tình trạng: Đã trả lời, chờ xác nhận văn bản.</w:t>
             </w:r>
           </w:p>
           <w:p>
@@ -7109,10 +7590,10 @@
                 <w:rFonts w:ascii="Arial" w:hAnsi="Arial" w:eastAsia="Arial"/>
                 <w:b w:val="0"/>
                 <w:i w:val="0"/>
-                <w:color w:val="BFBFBF"/>
-                <w:sz w:val="16"/>
-              </w:rPr>
-              <w:t>.............................................................................................................................................................................................................</w:t>
+                <w:color w:val="1A4D6B"/>
+                <w:sz w:val="18"/>
+              </w:rPr>
+              <w:t>Xác nhận: ....................................................................................................................................................................................</w:t>
             </w:r>
           </w:p>
           <w:p>
@@ -7823,6 +8304,30 @@
         <w:t>A5 tìm thêm, chưa có trên MIC</w:t>
       </w:r>
     </w:p>
+    <w:p>
+      <w:pPr>
+        <w:spacing w:before="0" w:after="60"/>
+      </w:pPr>
+      <w:r>
+        <w:rPr>
+          <w:rFonts w:ascii="Arial" w:hAnsi="Arial" w:eastAsia="Arial"/>
+          <w:b/>
+          <w:i w:val="0"/>
+          <w:color w:val="E08A1E"/>
+          <w:sz w:val="20"/>
+        </w:rPr>
+        <w:t xml:space="preserve">Tình trạng trả lời: </w:t>
+      </w:r>
+      <w:r>
+        <w:rPr>
+          <w:rFonts w:ascii="Arial" w:hAnsi="Arial" w:eastAsia="Arial"/>
+          <w:b w:val="0"/>
+          <w:i w:val="0"/>
+          <w:sz w:val="20"/>
+        </w:rPr>
+        <w:t>Đã trả lời, chờ xác nhận văn bản</w:t>
+      </w:r>
+    </w:p>
     <w:tbl>
       <w:tblPr>
         <w:tblW w:type="dxa" w:w="9639"/>
@@ -8133,17 +8638,31 @@
           </w:p>
           <w:p>
             <w:pPr>
-              <w:spacing w:before="200"/>
+              <w:spacing w:before="120"/>
             </w:pPr>
             <w:r>
               <w:rPr>
                 <w:rFonts w:ascii="Arial" w:hAnsi="Arial" w:eastAsia="Arial"/>
                 <w:b w:val="0"/>
                 <w:i w:val="0"/>
-                <w:color w:val="BFBFBF"/>
-                <w:sz w:val="16"/>
-              </w:rPr>
-              <w:t>.............................................................................................................................................................................................................</w:t>
+                <w:sz w:val="20"/>
+              </w:rPr>
+              <w:t>Chưa có ngân sách, chỉ có chi phí thực chi, chưa có giới hạn ngân sách. Giám đốc không phê duyệt chi phí, chỉ tới cấp Trưởng phòng.</w:t>
+            </w:r>
+          </w:p>
+          <w:p>
+            <w:pPr>
+              <w:spacing w:before="60"/>
+            </w:pPr>
+            <w:r>
+              <w:rPr>
+                <w:rFonts w:ascii="Arial" w:hAnsi="Arial" w:eastAsia="Arial"/>
+                <w:b w:val="0"/>
+                <w:i/>
+                <w:color w:val="6B6B6B"/>
+                <w:sz w:val="18"/>
+              </w:rPr>
+              <w:t>Nguồn: Chị Ngân, Trưởng phòng SX, trả lời qua chat 24/10 09:30. Tình trạng: Đã trả lời, chờ xác nhận văn bản.</w:t>
             </w:r>
           </w:p>
           <w:p>
@@ -8155,10 +8674,10 @@
                 <w:rFonts w:ascii="Arial" w:hAnsi="Arial" w:eastAsia="Arial"/>
                 <w:b w:val="0"/>
                 <w:i w:val="0"/>
-                <w:color w:val="BFBFBF"/>
-                <w:sz w:val="16"/>
-              </w:rPr>
-              <w:t>.............................................................................................................................................................................................................</w:t>
+                <w:color w:val="1A4D6B"/>
+                <w:sz w:val="18"/>
+              </w:rPr>
+              <w:t>Xác nhận: ....................................................................................................................................................................................</w:t>
             </w:r>
           </w:p>
           <w:p>
@@ -8231,7 +8750,7 @@
           <w:color w:val="6B6B6B"/>
           <w:sz w:val="17"/>
         </w:rPr>
-        <w:t>Giám đốc V1 C1 lại nói chi phí ngoài ngân sách phải trình Giám đốc phụ trách (xem M12).</w:t>
+        <w:t>Câu trả lời này khác câu Giám đốc trả lời ở vòng 1 (chi phí ngoài ngân sách phải trình Giám đốc phụ trách) và khác hạn mức 3 triệu, 5 triệu trong tệp quy trình thanh toán, nên còn cần Giám đốc xác nhận. Giám đốc V1 C1 lại nói chi phí ngoài ngân sách phải trình Giám đốc phụ trách (xem M12).</w:t>
       </w:r>
     </w:p>
     <w:p>

</xml_diff>